<commit_message>
ajustei template de ficha da colonia, e mudei zip_code pra cep, facilitar
</commit_message>
<xml_diff>
--- a/resources/templates/ficha_1.docx
+++ b/resources/templates/ficha_1.docx
@@ -1,86 +1,231 @@
 
 <file path=word/document.xml><?xml version="1.0" encoding="utf-8"?>
-<w:document xmlns:wpc="http://schemas.microsoft.com/office/word/2010/wordprocessingCanvas" xmlns:cx="http://schemas.microsoft.com/office/drawing/2014/chartex" xmlns:cx1="http://schemas.microsoft.com/office/drawing/2015/9/8/chartex" xmlns:cx2="http://schemas.microsoft.com/office/drawing/2015/10/21/chartex" xmlns:cx3="http://schemas.microsoft.com/office/drawing/2016/5/9/chartex" xmlns:cx4="http://schemas.microsoft.com/office/drawing/2016/5/10/chartex" xmlns:cx5="http://schemas.microsoft.com/office/drawing/2016/5/11/chartex" xmlns:cx6="http://schemas.microsoft.com/office/drawing/2016/5/12/chartex" xmlns:cx7="http://schemas.microsoft.com/office/drawing/2016/5/13/chartex" xmlns:cx8="http://schemas.microsoft.com/office/drawing/2016/5/14/chartex" xmlns:mc="http://schemas.openxmlformats.org/markup-compatibility/2006" xmlns:aink="http://schemas.microsoft.com/office/drawing/2016/ink" xmlns:am3d="http://schemas.microsoft.com/office/drawing/2017/model3d" xmlns:o="urn:schemas-microsoft-com:office:office" xmlns:oel="http://schemas.microsoft.com/office/2019/extlst" xmlns:r="http://schemas.openxmlformats.org/officeDocument/2006/relationships" xmlns:m="http://schemas.openxmlformats.org/officeDocument/2006/math" xmlns:v="urn:schemas-microsoft-com:vml" xmlns:wp14="http://schemas.microsoft.com/office/word/2010/wordprocessingDrawing" xmlns:wp="http://schemas.openxmlformats.org/drawingml/2006/wordprocessingDrawing" xmlns:w10="urn:schemas-microsoft-com:office:word" xmlns:w="http://schemas.openxmlformats.org/wordprocessingml/2006/main" xmlns:w14="http://schemas.microsoft.com/office/word/2010/wordml" xmlns:w15="http://schemas.microsoft.com/office/word/2012/wordml" xmlns:w16cex="http://schemas.microsoft.com/office/word/2018/wordml/cex" xmlns:w16cid="http://schemas.microsoft.com/office/word/2016/wordml/cid" xmlns:w16="http://schemas.microsoft.com/office/word/2018/wordml" xmlns:w16du="http://schemas.microsoft.com/office/word/2023/wordml/word16du" xmlns:w16sdtdh="http://schemas.microsoft.com/office/word/2020/wordml/sdtdatahash" xmlns:w16sdtfl="http://schemas.microsoft.com/office/word/2024/wordml/sdtformatlock" xmlns:w16se="http://schemas.microsoft.com/office/word/2015/wordml/symex" xmlns:wpg="http://schemas.microsoft.com/office/word/2010/wordprocessingGroup" xmlns:wpi="http://schemas.microsoft.com/office/word/2010/wordprocessingInk" xmlns:wne="http://schemas.microsoft.com/office/word/2006/wordml" xmlns:wps="http://schemas.microsoft.com/office/word/2010/wordprocessingShape" mc:Ignorable="w14 w15 w16se w16cid w16 w16cex w16sdtdh w16sdtfl w16du wp14">
+<w:document xmlns:o="urn:schemas-microsoft-com:office:office" xmlns:r="http://schemas.openxmlformats.org/officeDocument/2006/relationships" xmlns:v="urn:schemas-microsoft-com:vml" xmlns:w="http://schemas.openxmlformats.org/wordprocessingml/2006/main" xmlns:w10="urn:schemas-microsoft-com:office:word" xmlns:wp="http://schemas.openxmlformats.org/drawingml/2006/wordprocessingDrawing" xmlns:wps="http://schemas.microsoft.com/office/word/2010/wordprocessingShape" xmlns:wpg="http://schemas.microsoft.com/office/word/2010/wordprocessingGroup" xmlns:mc="http://schemas.openxmlformats.org/markup-compatibility/2006" xmlns:wp14="http://schemas.microsoft.com/office/word/2010/wordprocessingDrawing" xmlns:w14="http://schemas.microsoft.com/office/word/2010/wordml" xmlns:w15="http://schemas.microsoft.com/office/word/2012/wordml" mc:Ignorable="w14 wp14 w15">
   <w:body>
     <w:p>
       <w:pPr>
+        <w:pStyle w:val="Normal"/>
         <w:jc w:val="center"/>
+        <w:rPr/>
       </w:pPr>
-      <w:r>
-        <w:pict w14:anchorId="72CBCD64">
-          <v:rect id="Quadro1" o:spid="_x0000_s1027" style="position:absolute;left:0;text-align:left;margin-left:-9pt;margin-top:.05pt;width:126.4pt;height:89.85pt;z-index:251657216" filled="f" stroked="f" strokecolor="#3465a4">
-            <v:fill o:detectmouseclick="t"/>
-            <v:stroke joinstyle="round"/>
-          </v:rect>
-        </w:pict>
-      </w:r>
-      <w:r>
-        <w:pict w14:anchorId="0F935B75">
-          <v:rect id="_x0000_s1026" style="position:absolute;left:0;text-align:left;margin-left:-9pt;margin-top:.05pt;width:143.4pt;height:89.85pt;z-index:251658240" filled="f" stroked="f" strokecolor="#3465a4">
-            <v:fill o:detectmouseclick="t"/>
-            <v:stroke joinstyle="round"/>
-            <v:textbox style="mso-next-textbox:#_x0000_s1026">
-              <w:txbxContent>
-                <w:p>
-                  <w:pPr>
-                    <w:pStyle w:val="Contedodoquadro"/>
-                  </w:pPr>
-                  <w:r>
-                    <w:rPr>
-                      <w:noProof/>
-                      <w:lang w:eastAsia="pt-BR"/>
-                    </w:rPr>
-                    <w:drawing>
-                      <wp:inline distT="0" distB="0" distL="0" distR="0" wp14:anchorId="68910FAE" wp14:editId="2013787B">
-                        <wp:extent cx="1649095" cy="1054100"/>
-                        <wp:effectExtent l="0" t="0" r="0" b="0"/>
-                        <wp:docPr id="5" name="Figura1"/>
-                        <wp:cNvGraphicFramePr>
-                          <a:graphicFrameLocks xmlns:a="http://schemas.openxmlformats.org/drawingml/2006/main" noChangeAspect="1"/>
-                        </wp:cNvGraphicFramePr>
-                        <a:graphic xmlns:a="http://schemas.openxmlformats.org/drawingml/2006/main">
-                          <a:graphicData uri="http://schemas.openxmlformats.org/drawingml/2006/picture">
-                            <pic:pic xmlns:pic="http://schemas.openxmlformats.org/drawingml/2006/picture">
-                              <pic:nvPicPr>
-                                <pic:cNvPr id="5" name="Figura1"/>
-                                <pic:cNvPicPr>
-                                  <a:picLocks noChangeAspect="1" noChangeArrowheads="1"/>
-                                </pic:cNvPicPr>
-                              </pic:nvPicPr>
-                              <pic:blipFill>
-                                <a:blip r:embed="rId4"/>
-                                <a:stretch>
-                                  <a:fillRect/>
-                                </a:stretch>
-                              </pic:blipFill>
-                              <pic:spPr bwMode="auto">
-                                <a:xfrm>
-                                  <a:off x="0" y="0"/>
-                                  <a:ext cx="1649095" cy="1054100"/>
-                                </a:xfrm>
-                                <a:prstGeom prst="rect">
-                                  <a:avLst/>
-                                </a:prstGeom>
-                              </pic:spPr>
-                            </pic:pic>
-                          </a:graphicData>
-                        </a:graphic>
-                      </wp:inline>
-                    </w:drawing>
-                  </w:r>
-                </w:p>
-              </w:txbxContent>
-            </v:textbox>
-          </v:rect>
-        </w:pict>
-      </w:r>
       <w:r>
         <w:rPr>
           <w:b/>
           <w:sz w:val="20"/>
           <w:szCs w:val="20"/>
         </w:rPr>
-        <w:tab/>
+        <mc:AlternateContent>
+          <mc:Choice Requires="wps">
+            <w:drawing>
+              <wp:anchor behindDoc="0" distT="0" distB="0" distL="0" distR="0" simplePos="0" locked="0" layoutInCell="1" allowOverlap="1" relativeHeight="2">
+                <wp:simplePos x="0" y="0"/>
+                <wp:positionH relativeFrom="column">
+                  <wp:posOffset>-114300</wp:posOffset>
+                </wp:positionH>
+                <wp:positionV relativeFrom="paragraph">
+                  <wp:posOffset>635</wp:posOffset>
+                </wp:positionV>
+                <wp:extent cx="1605280" cy="1141095"/>
+                <wp:effectExtent l="0" t="0" r="0" b="0"/>
+                <wp:wrapNone/>
+                <wp:docPr id="1" name="Quadro1"/>
+                <a:graphic xmlns:a="http://schemas.openxmlformats.org/drawingml/2006/main">
+                  <a:graphicData uri="http://schemas.microsoft.com/office/word/2010/wordprocessingShape">
+                    <wps:wsp>
+                      <wps:cNvSpPr/>
+                      <wps:spPr>
+                        <a:xfrm>
+                          <a:off x="0" y="0"/>
+                          <a:ext cx="1605240" cy="1141200"/>
+                        </a:xfrm>
+                        <a:prstGeom prst="rect">
+                          <a:avLst/>
+                        </a:prstGeom>
+                        <a:noFill/>
+                        <a:ln w="0">
+                          <a:noFill/>
+                        </a:ln>
+                      </wps:spPr>
+                      <wps:style>
+                        <a:lnRef idx="0"/>
+                        <a:fillRef idx="0"/>
+                        <a:effectRef idx="0"/>
+                        <a:fontRef idx="minor"/>
+                      </wps:style>
+                      <wps:bodyPr/>
+                    </wps:wsp>
+                  </a:graphicData>
+                </a:graphic>
+              </wp:anchor>
+            </w:drawing>
+          </mc:Choice>
+          <mc:Fallback>
+            <w:pict>
+              <v:rect id="shape_0" ID="Quadro1" path="m0,0l-2147483645,0l-2147483645,-2147483646l0,-2147483646xe" stroked="f" o:allowincell="f" style="position:absolute;margin-left:-9pt;margin-top:0.05pt;width:126.35pt;height:89.8pt;mso-wrap-style:none;v-text-anchor:middle">
+                <v:fill o:detectmouseclick="t" on="false"/>
+                <v:stroke color="#3465a4" joinstyle="round" endcap="flat"/>
+                <w10:wrap type="none"/>
+              </v:rect>
+            </w:pict>
+          </mc:Fallback>
+        </mc:AlternateContent>
+        <mc:AlternateContent>
+          <mc:Choice Requires="wps">
+            <w:drawing>
+              <wp:anchor behindDoc="0" distT="0" distB="0" distL="0" distR="0" simplePos="0" locked="0" layoutInCell="1" allowOverlap="1" relativeHeight="3">
+                <wp:simplePos x="0" y="0"/>
+                <wp:positionH relativeFrom="column">
+                  <wp:posOffset>-114300</wp:posOffset>
+                </wp:positionH>
+                <wp:positionV relativeFrom="paragraph">
+                  <wp:posOffset>635</wp:posOffset>
+                </wp:positionV>
+                <wp:extent cx="1821180" cy="1141095"/>
+                <wp:effectExtent l="0" t="0" r="0" b="0"/>
+                <wp:wrapNone/>
+                <wp:docPr id="2" name="Quadro1"/>
+                <a:graphic xmlns:a="http://schemas.openxmlformats.org/drawingml/2006/main">
+                  <a:graphicData uri="http://schemas.microsoft.com/office/word/2010/wordprocessingShape">
+                    <wps:wsp>
+                      <wps:cNvSpPr/>
+                      <wps:spPr>
+                        <a:xfrm>
+                          <a:off x="0" y="0"/>
+                          <a:ext cx="1821240" cy="1141200"/>
+                        </a:xfrm>
+                        <a:prstGeom prst="rect">
+                          <a:avLst/>
+                        </a:prstGeom>
+                        <a:noFill/>
+                        <a:ln w="0">
+                          <a:noFill/>
+                        </a:ln>
+                      </wps:spPr>
+                      <wps:style>
+                        <a:lnRef idx="0"/>
+                        <a:fillRef idx="0"/>
+                        <a:effectRef idx="0"/>
+                        <a:fontRef idx="minor"/>
+                      </wps:style>
+                      <wps:txbx>
+                        <w:txbxContent>
+                          <w:p>
+                            <w:pPr>
+                              <w:pStyle w:val="Contedodoquadro"/>
+                              <w:rPr/>
+                            </w:pPr>
+                            <w:r>
+                              <w:rPr/>
+                              <w:drawing>
+                                <wp:inline distT="0" distB="0" distL="0" distR="0">
+                                  <wp:extent cx="1649095" cy="1054100"/>
+                                  <wp:effectExtent l="0" t="0" r="0" b="0"/>
+                                  <wp:docPr id="4" name="Figura1" descr=""/>
+                                  <wp:cNvGraphicFramePr>
+                                    <a:graphicFrameLocks xmlns:a="http://schemas.openxmlformats.org/drawingml/2006/main" noChangeAspect="1"/>
+                                  </wp:cNvGraphicFramePr>
+                                  <a:graphic xmlns:a="http://schemas.openxmlformats.org/drawingml/2006/main">
+                                    <a:graphicData uri="http://schemas.openxmlformats.org/drawingml/2006/picture">
+                                      <pic:pic xmlns:pic="http://schemas.openxmlformats.org/drawingml/2006/picture">
+                                        <pic:nvPicPr>
+                                          <pic:cNvPr id="4" name="Figura1" descr=""/>
+                                          <pic:cNvPicPr>
+                                            <a:picLocks noChangeAspect="1" noChangeArrowheads="1"/>
+                                          </pic:cNvPicPr>
+                                        </pic:nvPicPr>
+                                        <pic:blipFill>
+                                          <a:blip r:embed="rId2"/>
+                                          <a:stretch>
+                                            <a:fillRect/>
+                                          </a:stretch>
+                                        </pic:blipFill>
+                                        <pic:spPr bwMode="auto">
+                                          <a:xfrm>
+                                            <a:off x="0" y="0"/>
+                                            <a:ext cx="1649095" cy="1054100"/>
+                                          </a:xfrm>
+                                          <a:prstGeom prst="rect">
+                                            <a:avLst/>
+                                          </a:prstGeom>
+                                        </pic:spPr>
+                                      </pic:pic>
+                                    </a:graphicData>
+                                  </a:graphic>
+                                </wp:inline>
+                              </w:drawing>
+                            </w:r>
+                          </w:p>
+                        </w:txbxContent>
+                      </wps:txbx>
+                      <wps:bodyPr anchor="t">
+                        <a:noAutofit/>
+                      </wps:bodyPr>
+                    </wps:wsp>
+                  </a:graphicData>
+                </a:graphic>
+              </wp:anchor>
+            </w:drawing>
+          </mc:Choice>
+          <mc:Fallback>
+            <w:pict>
+              <v:rect id="shape_0" ID="Quadro1" path="m0,0l-2147483645,0l-2147483645,-2147483646l0,-2147483646xe" fillcolor="white" stroked="f" o:allowincell="f" style="position:absolute;margin-left:-9pt;margin-top:0.05pt;width:143.35pt;height:89.8pt;mso-wrap-style:none;v-text-anchor:middle">
+                <v:fill o:detectmouseclick="t" type="solid" color2="black" opacity="0"/>
+                <v:stroke color="#3465a4" joinstyle="round" endcap="flat"/>
+                <v:textbox>
+                  <w:txbxContent>
+                    <w:p>
+                      <w:pPr>
+                        <w:pStyle w:val="Contedodoquadro"/>
+                        <w:rPr/>
+                      </w:pPr>
+                      <w:r>
+                        <w:rPr/>
+                        <w:drawing>
+                          <wp:inline distT="0" distB="0" distL="0" distR="0">
+                            <wp:extent cx="1649095" cy="1054100"/>
+                            <wp:effectExtent l="0" t="0" r="0" b="0"/>
+                            <wp:docPr id="5" name="Figura1" descr=""/>
+                            <wp:cNvGraphicFramePr>
+                              <a:graphicFrameLocks xmlns:a="http://schemas.openxmlformats.org/drawingml/2006/main" noChangeAspect="1"/>
+                            </wp:cNvGraphicFramePr>
+                            <a:graphic xmlns:a="http://schemas.openxmlformats.org/drawingml/2006/main">
+                              <a:graphicData uri="http://schemas.openxmlformats.org/drawingml/2006/picture">
+                                <pic:pic xmlns:pic="http://schemas.openxmlformats.org/drawingml/2006/picture">
+                                  <pic:nvPicPr>
+                                    <pic:cNvPr id="5" name="Figura1" descr=""/>
+                                    <pic:cNvPicPr>
+                                      <a:picLocks noChangeAspect="1" noChangeArrowheads="1"/>
+                                    </pic:cNvPicPr>
+                                  </pic:nvPicPr>
+                                  <pic:blipFill>
+                                    <a:blip r:embed="rId3"/>
+                                    <a:stretch>
+                                      <a:fillRect/>
+                                    </a:stretch>
+                                  </pic:blipFill>
+                                  <pic:spPr bwMode="auto">
+                                    <a:xfrm>
+                                      <a:off x="0" y="0"/>
+                                      <a:ext cx="1649095" cy="1054100"/>
+                                    </a:xfrm>
+                                    <a:prstGeom prst="rect">
+                                      <a:avLst/>
+                                    </a:prstGeom>
+                                  </pic:spPr>
+                                </pic:pic>
+                              </a:graphicData>
+                            </a:graphic>
+                          </wp:inline>
+                        </w:drawing>
+                      </w:r>
+                    </w:p>
+                  </w:txbxContent>
+                </v:textbox>
+                <w10:wrap type="none"/>
+              </v:rect>
+            </w:pict>
+          </mc:Fallback>
+        </mc:AlternateContent>
       </w:r>
       <w:r>
         <w:rPr>
@@ -89,226 +234,150 @@
           <w:szCs w:val="20"/>
         </w:rPr>
         <w:tab/>
-      </w:r>
-      <w:r>
+        <w:tab/>
+        <w:t>COLÔNIA DOS PESCADORES PROFISSIONAIS DE</w:t>
+      </w:r>
+    </w:p>
+    <w:p>
+      <w:pPr>
+        <w:pStyle w:val="Normal"/>
+        <w:jc w:val="center"/>
         <w:rPr>
           <w:b/>
           <w:sz w:val="20"/>
           <w:szCs w:val="20"/>
         </w:rPr>
-        <w:t>COLÔNIA DOS PESCADORES PROFISSIONAIS DE</w:t>
+      </w:pPr>
+      <w:r>
+        <w:rPr>
+          <w:b/>
+          <w:sz w:val="20"/>
+          <w:szCs w:val="20"/>
+        </w:rPr>
+        <w:tab/>
+        <w:t>FRUTAL E REGIÃO Z -18</w:t>
       </w:r>
     </w:p>
     <w:p>
       <w:pPr>
+        <w:pStyle w:val="Normal"/>
         <w:jc w:val="center"/>
+        <w:rPr/>
+      </w:pPr>
+      <w:r>
         <w:rPr>
           <w:b/>
           <w:sz w:val="20"/>
           <w:szCs w:val="20"/>
         </w:rPr>
-      </w:pPr>
-      <w:r>
-        <w:rPr>
-          <w:b/>
-          <w:sz w:val="20"/>
-          <w:szCs w:val="20"/>
-        </w:rPr>
         <w:tab/>
-      </w:r>
-      <w:r>
-        <w:rPr>
-          <w:b/>
-          <w:sz w:val="20"/>
-          <w:szCs w:val="20"/>
-        </w:rPr>
-        <w:t>FRUTAL E REGIÃO Z -18</w:t>
+        <w:tab/>
+        <w:tab/>
+        <w:t>R: São Franc. De Sales, N.º1048 – Progresso CEP: 38.200 – 000</w:t>
       </w:r>
     </w:p>
     <w:p>
       <w:pPr>
-        <w:jc w:val="center"/>
-      </w:pPr>
-      <w:r>
-        <w:rPr>
-          <w:b/>
-          <w:sz w:val="20"/>
-          <w:szCs w:val="20"/>
-        </w:rPr>
-        <w:tab/>
-      </w:r>
-      <w:r>
-        <w:rPr>
-          <w:b/>
-          <w:sz w:val="20"/>
-          <w:szCs w:val="20"/>
-        </w:rPr>
-        <w:tab/>
-      </w:r>
-      <w:r>
-        <w:rPr>
-          <w:b/>
-          <w:sz w:val="20"/>
-          <w:szCs w:val="20"/>
-        </w:rPr>
-        <w:tab/>
-      </w:r>
-      <w:r>
-        <w:rPr>
-          <w:b/>
-          <w:sz w:val="20"/>
-          <w:szCs w:val="20"/>
-        </w:rPr>
-        <w:t xml:space="preserve">R: São Franc. De Sales, </w:t>
-      </w:r>
-      <w:proofErr w:type="gramStart"/>
-      <w:r>
-        <w:rPr>
-          <w:b/>
-          <w:sz w:val="20"/>
-          <w:szCs w:val="20"/>
-        </w:rPr>
-        <w:t>N.º</w:t>
-      </w:r>
-      <w:proofErr w:type="gramEnd"/>
-      <w:r>
-        <w:rPr>
-          <w:b/>
-          <w:sz w:val="20"/>
-          <w:szCs w:val="20"/>
-        </w:rPr>
-        <w:t>1048 – Progresso CEP: 38.200 – 000</w:t>
-      </w:r>
-    </w:p>
-    <w:p>
-      <w:pPr>
+        <w:pStyle w:val="Normal"/>
         <w:tabs>
-          <w:tab w:val="left" w:pos="1263"/>
-          <w:tab w:val="center" w:pos="4472"/>
+          <w:tab w:val="clear" w:pos="709"/>
+          <w:tab w:val="left" w:pos="1263" w:leader="none"/>
+          <w:tab w:val="center" w:pos="4472" w:leader="none"/>
         </w:tabs>
         <w:jc w:val="center"/>
+        <w:rPr/>
       </w:pPr>
       <w:r>
         <w:rPr>
-          <w:rFonts w:ascii="Monotype Corsiva" w:hAnsi="Monotype Corsiva" w:cs="Monotype Corsiva"/>
+          <w:rFonts w:cs="Monotype Corsiva" w:ascii="Monotype Corsiva" w:hAnsi="Monotype Corsiva"/>
           <w:b/>
           <w:i/>
           <w:sz w:val="22"/>
           <w:szCs w:val="22"/>
         </w:rPr>
         <w:tab/>
-      </w:r>
-      <w:r>
-        <w:rPr>
-          <w:rFonts w:ascii="Monotype Corsiva" w:hAnsi="Monotype Corsiva" w:cs="Monotype Corsiva"/>
+        <w:t>Tel./ (0xx34) 3423-6691</w:t>
+      </w:r>
+    </w:p>
+    <w:p>
+      <w:pPr>
+        <w:pStyle w:val="Normal"/>
+        <w:tabs>
+          <w:tab w:val="clear" w:pos="709"/>
+          <w:tab w:val="left" w:pos="1263" w:leader="none"/>
+          <w:tab w:val="center" w:pos="4472" w:leader="none"/>
+        </w:tabs>
+        <w:jc w:val="center"/>
+        <w:rPr/>
+      </w:pPr>
+      <w:r>
+        <w:rPr>
+          <w:rFonts w:cs="Monotype Corsiva" w:ascii="Monotype Corsiva" w:hAnsi="Monotype Corsiva"/>
           <w:b/>
           <w:i/>
           <w:sz w:val="22"/>
           <w:szCs w:val="22"/>
         </w:rPr>
-        <w:t>Tel./ (0xx34) 3423-6691</w:t>
+        <w:tab/>
+        <w:t>CNPJ  nº. 07.500.616/0001-70</w:t>
       </w:r>
     </w:p>
     <w:p>
       <w:pPr>
-        <w:tabs>
-          <w:tab w:val="left" w:pos="1263"/>
-          <w:tab w:val="center" w:pos="4472"/>
-        </w:tabs>
+        <w:pStyle w:val="Normal"/>
         <w:jc w:val="center"/>
+        <w:rPr>
+          <w:rFonts w:ascii="Monotype Corsiva" w:hAnsi="Monotype Corsiva" w:cs="Monotype Corsiva"/>
+          <w:b/>
+          <w:i/>
+          <w:i/>
+          <w:sz w:val="22"/>
+          <w:szCs w:val="22"/>
+        </w:rPr>
       </w:pPr>
       <w:r>
         <w:rPr>
-          <w:rFonts w:ascii="Monotype Corsiva" w:hAnsi="Monotype Corsiva" w:cs="Monotype Corsiva"/>
+          <w:rFonts w:cs="Monotype Corsiva" w:ascii="Monotype Corsiva" w:hAnsi="Monotype Corsiva"/>
           <w:b/>
           <w:i/>
           <w:sz w:val="22"/>
           <w:szCs w:val="22"/>
         </w:rPr>
         <w:tab/>
-      </w:r>
-      <w:proofErr w:type="gramStart"/>
-      <w:r>
+        <w:tab/>
+        <w:t>Presidente Fundadora – DABIANE LUZ CLEMENTE</w:t>
+      </w:r>
+    </w:p>
+    <w:p>
+      <w:pPr>
+        <w:pStyle w:val="Normal"/>
+        <w:tabs>
+          <w:tab w:val="clear" w:pos="709"/>
+          <w:tab w:val="left" w:pos="2565" w:leader="none"/>
+        </w:tabs>
         <w:rPr>
           <w:rFonts w:ascii="Monotype Corsiva" w:hAnsi="Monotype Corsiva" w:cs="Monotype Corsiva"/>
+          <w:b/>
+          <w:i/>
+          <w:i/>
+          <w:sz w:val="22"/>
+          <w:szCs w:val="22"/>
+        </w:rPr>
+      </w:pPr>
+      <w:r>
+        <w:rPr>
+          <w:rFonts w:cs="Monotype Corsiva" w:ascii="Monotype Corsiva" w:hAnsi="Monotype Corsiva"/>
           <w:b/>
           <w:i/>
           <w:sz w:val="22"/>
           <w:szCs w:val="22"/>
         </w:rPr>
-        <w:t>CNPJ  nº</w:t>
-      </w:r>
-      <w:proofErr w:type="gramEnd"/>
-      <w:r>
-        <w:rPr>
-          <w:rFonts w:ascii="Monotype Corsiva" w:hAnsi="Monotype Corsiva" w:cs="Monotype Corsiva"/>
-          <w:b/>
-          <w:i/>
-          <w:sz w:val="22"/>
-          <w:szCs w:val="22"/>
-        </w:rPr>
-        <w:t>. 07.500.616/0001-70</w:t>
       </w:r>
     </w:p>
     <w:p>
       <w:pPr>
-        <w:jc w:val="center"/>
-        <w:rPr>
-          <w:rFonts w:ascii="Monotype Corsiva" w:hAnsi="Monotype Corsiva" w:cs="Monotype Corsiva"/>
-          <w:b/>
-          <w:i/>
-          <w:sz w:val="22"/>
-          <w:szCs w:val="22"/>
-        </w:rPr>
-      </w:pPr>
-      <w:r>
-        <w:rPr>
-          <w:rFonts w:ascii="Monotype Corsiva" w:hAnsi="Monotype Corsiva" w:cs="Monotype Corsiva"/>
-          <w:b/>
-          <w:i/>
-          <w:sz w:val="22"/>
-          <w:szCs w:val="22"/>
-        </w:rPr>
-        <w:tab/>
-      </w:r>
-      <w:r>
-        <w:rPr>
-          <w:rFonts w:ascii="Monotype Corsiva" w:hAnsi="Monotype Corsiva" w:cs="Monotype Corsiva"/>
-          <w:b/>
-          <w:i/>
-          <w:sz w:val="22"/>
-          <w:szCs w:val="22"/>
-        </w:rPr>
-        <w:tab/>
-      </w:r>
-      <w:r>
-        <w:rPr>
-          <w:rFonts w:ascii="Monotype Corsiva" w:hAnsi="Monotype Corsiva" w:cs="Monotype Corsiva"/>
-          <w:b/>
-          <w:i/>
-          <w:sz w:val="22"/>
-          <w:szCs w:val="22"/>
-        </w:rPr>
-        <w:t>Presidente Fundadora – DABIANE LUZ CLEMENTE</w:t>
-      </w:r>
-    </w:p>
-    <w:p>
-      <w:pPr>
-        <w:tabs>
-          <w:tab w:val="left" w:pos="2565"/>
-        </w:tabs>
-        <w:rPr>
-          <w:rFonts w:ascii="Monotype Corsiva" w:hAnsi="Monotype Corsiva" w:cs="Monotype Corsiva"/>
-          <w:b/>
-          <w:i/>
-          <w:sz w:val="22"/>
-          <w:szCs w:val="22"/>
-        </w:rPr>
-      </w:pPr>
-    </w:p>
-    <w:p>
-      <w:pPr>
-        <w:ind w:left="2832" w:firstLine="708"/>
+        <w:pStyle w:val="Normal"/>
+        <w:ind w:firstLine="708" w:left="2832"/>
         <w:rPr>
           <w:b/>
           <w:sz w:val="22"/>
@@ -338,7 +407,9 @@
     </w:p>
     <w:p>
       <w:pPr>
+        <w:pStyle w:val="Normal"/>
         <w:jc w:val="center"/>
+        <w:rPr/>
       </w:pPr>
       <w:r>
         <w:rPr>
@@ -353,29 +424,60 @@
           <w:sz w:val="20"/>
           <w:szCs w:val="20"/>
         </w:rPr>
-        <w:t>${RECORD_NUMBER}</w:t>
+        <w:t>${</w:t>
+      </w:r>
+      <w:r>
+        <w:rPr>
+          <w:b/>
+          <w:sz w:val="22"/>
+          <w:szCs w:val="22"/>
+        </w:rPr>
+        <w:t>RECORD_NUMBER</w:t>
+      </w:r>
+      <w:r>
+        <w:rPr>
+          <w:b/>
+          <w:sz w:val="20"/>
+          <w:szCs w:val="20"/>
+        </w:rPr>
+        <w:t>}</w:t>
       </w:r>
     </w:p>
     <w:tbl>
       <w:tblPr>
         <w:tblW w:w="9300" w:type="dxa"/>
-        <w:tblLook w:val="0000" w:firstRow="0" w:lastRow="0" w:firstColumn="0" w:lastColumn="0" w:noHBand="0" w:noVBand="0"/>
+        <w:jc w:val="left"/>
+        <w:tblInd w:w="0" w:type="dxa"/>
+        <w:tblLayout w:type="fixed"/>
+        <w:tblCellMar>
+          <w:top w:w="0" w:type="dxa"/>
+          <w:left w:w="108" w:type="dxa"/>
+          <w:bottom w:w="0" w:type="dxa"/>
+          <w:right w:w="108" w:type="dxa"/>
+        </w:tblCellMar>
+        <w:tblLook w:val="0000" w:noHBand="0" w:noVBand="0" w:firstColumn="0" w:lastRow="0" w:lastColumn="0" w:firstRow="0"/>
       </w:tblPr>
       <w:tblGrid>
         <w:gridCol w:w="2271"/>
-        <w:gridCol w:w="1665"/>
-        <w:gridCol w:w="604"/>
+        <w:gridCol w:w="1664"/>
+        <w:gridCol w:w="605"/>
         <w:gridCol w:w="1237"/>
-        <w:gridCol w:w="3523"/>
+        <w:gridCol w:w="3522"/>
       </w:tblGrid>
       <w:tr>
+        <w:trPr/>
         <w:tc>
           <w:tcPr>
             <w:tcW w:w="5777" w:type="dxa"/>
             <w:gridSpan w:val="4"/>
-            <w:shd w:val="clear" w:color="auto" w:fill="auto"/>
+            <w:tcBorders/>
+            <w:shd w:color="auto" w:fill="auto" w:val="clear"/>
           </w:tcPr>
           <w:p>
+            <w:pPr>
+              <w:pStyle w:val="Normal"/>
+              <w:rPr/>
+            </w:pPr>
             <w:r>
               <w:rPr>
                 <w:sz w:val="22"/>
@@ -385,7 +487,7 @@
             </w:r>
             <w:r>
               <w:rPr>
-                <w:rFonts w:ascii="Arial" w:hAnsi="Arial" w:cs="Arial"/>
+                <w:rFonts w:cs="Arial" w:ascii="Arial" w:hAnsi="Arial"/>
                 <w:b/>
                 <w:sz w:val="22"/>
                 <w:szCs w:val="22"/>
@@ -396,10 +498,15 @@
         </w:tc>
         <w:tc>
           <w:tcPr>
-            <w:tcW w:w="3523" w:type="dxa"/>
-            <w:shd w:val="clear" w:color="auto" w:fill="auto"/>
+            <w:tcW w:w="3522" w:type="dxa"/>
+            <w:tcBorders/>
+            <w:shd w:color="auto" w:fill="auto" w:val="clear"/>
           </w:tcPr>
           <w:p>
+            <w:pPr>
+              <w:pStyle w:val="Normal"/>
+              <w:rPr/>
+            </w:pPr>
             <w:r>
               <w:rPr>
                 <w:sz w:val="22"/>
@@ -409,44 +516,30 @@
             </w:r>
             <w:r>
               <w:rPr>
-                <w:rFonts w:ascii="Arial" w:hAnsi="Arial" w:cs="Arial"/>
+                <w:rFonts w:cs="Arial" w:ascii="Arial" w:hAnsi="Arial"/>
                 <w:b/>
                 <w:sz w:val="22"/>
                 <w:szCs w:val="22"/>
               </w:rPr>
-              <w:t>${BIRTHDA</w:t>
-            </w:r>
-            <w:r>
-              <w:rPr>
-                <w:rFonts w:ascii="Arial" w:hAnsi="Arial" w:cs="Arial"/>
-                <w:b/>
-                <w:sz w:val="22"/>
-                <w:szCs w:val="22"/>
-              </w:rPr>
-              <w:t>Y</w:t>
-            </w:r>
-            <w:r>
-              <w:rPr>
-                <w:rFonts w:ascii="Arial" w:hAnsi="Arial" w:cs="Arial"/>
-                <w:b/>
-                <w:sz w:val="22"/>
-                <w:szCs w:val="22"/>
-              </w:rPr>
-              <w:t>}</w:t>
+              <w:t>${BIRTHDAY}</w:t>
             </w:r>
           </w:p>
         </w:tc>
       </w:tr>
       <w:tr>
+        <w:trPr/>
         <w:tc>
           <w:tcPr>
             <w:tcW w:w="5777" w:type="dxa"/>
             <w:gridSpan w:val="4"/>
-            <w:shd w:val="clear" w:color="auto" w:fill="auto"/>
+            <w:tcBorders/>
+            <w:shd w:color="auto" w:fill="auto" w:val="clear"/>
           </w:tcPr>
           <w:p>
             <w:pPr>
+              <w:pStyle w:val="Normal"/>
               <w:jc w:val="both"/>
+              <w:rPr/>
             </w:pPr>
             <w:r>
               <w:rPr>
@@ -464,69 +557,51 @@
             </w:r>
             <w:r>
               <w:rPr>
-                <w:rFonts w:ascii="Arial" w:hAnsi="Arial" w:cs="Arial"/>
+                <w:rFonts w:cs="Arial" w:ascii="Arial" w:hAnsi="Arial"/>
                 <w:b/>
                 <w:sz w:val="22"/>
                 <w:szCs w:val="22"/>
               </w:rPr>
-              <w:t>${ADDRESS}</w:t>
-            </w:r>
-            <w:r>
-              <w:rPr>
-                <w:rFonts w:ascii="Arial" w:hAnsi="Arial" w:cs="Arial"/>
-                <w:b/>
-                <w:sz w:val="22"/>
-                <w:szCs w:val="22"/>
-              </w:rPr>
-              <w:t xml:space="preserve">, </w:t>
-            </w:r>
-            <w:r>
-              <w:rPr>
-                <w:rFonts w:ascii="Arial" w:hAnsi="Arial" w:cs="Arial"/>
-                <w:b/>
-                <w:sz w:val="22"/>
-                <w:szCs w:val="22"/>
-              </w:rPr>
-              <w:t>${NUMBER}</w:t>
+              <w:t>${ADDRESS}, ${NUMBER}</w:t>
             </w:r>
           </w:p>
         </w:tc>
         <w:tc>
           <w:tcPr>
-            <w:tcW w:w="3523" w:type="dxa"/>
-            <w:shd w:val="clear" w:color="auto" w:fill="auto"/>
+            <w:tcW w:w="3522" w:type="dxa"/>
+            <w:tcBorders/>
+            <w:shd w:color="auto" w:fill="auto" w:val="clear"/>
           </w:tcPr>
           <w:p>
             <w:pPr>
+              <w:pStyle w:val="Normal"/>
               <w:jc w:val="both"/>
+              <w:rPr/>
             </w:pPr>
             <w:r>
               <w:rPr>
                 <w:sz w:val="22"/>
                 <w:szCs w:val="22"/>
               </w:rPr>
-              <w:t xml:space="preserve">Bairro: </w:t>
-            </w:r>
-            <w:r>
-              <w:rPr>
-                <w:sz w:val="22"/>
-                <w:szCs w:val="22"/>
-              </w:rPr>
-              <w:t>${NEIGHBORHOOD}</w:t>
+              <w:t>Bairro: ${NEIGHBORHOOD}</w:t>
             </w:r>
           </w:p>
         </w:tc>
       </w:tr>
       <w:tr>
+        <w:trPr/>
         <w:tc>
           <w:tcPr>
-            <w:tcW w:w="3936" w:type="dxa"/>
+            <w:tcW w:w="3935" w:type="dxa"/>
             <w:gridSpan w:val="2"/>
-            <w:shd w:val="clear" w:color="auto" w:fill="auto"/>
+            <w:tcBorders/>
+            <w:shd w:color="auto" w:fill="auto" w:val="clear"/>
           </w:tcPr>
           <w:p>
             <w:pPr>
+              <w:pStyle w:val="Normal"/>
               <w:jc w:val="both"/>
+              <w:rPr/>
             </w:pPr>
             <w:r>
               <w:rPr>
@@ -542,16 +617,7 @@
                 <w:sz w:val="22"/>
                 <w:szCs w:val="22"/>
               </w:rPr>
-              <w:t>${CITY}</w:t>
-            </w:r>
-            <w:r>
-              <w:rPr>
-                <w:b/>
-                <w:bCs/>
-                <w:sz w:val="22"/>
-                <w:szCs w:val="22"/>
-              </w:rPr>
-              <w:t xml:space="preserve">, </w:t>
+              <w:t xml:space="preserve">${CITY}, </w:t>
             </w:r>
             <w:r>
               <w:rPr>
@@ -566,29 +632,41 @@
           </w:p>
           <w:p>
             <w:pPr>
+              <w:pStyle w:val="Normal"/>
               <w:jc w:val="both"/>
+              <w:rPr>
+                <w:sz w:val="22"/>
+                <w:szCs w:val="22"/>
+              </w:rPr>
             </w:pPr>
             <w:r>
               <w:rPr>
                 <w:sz w:val="22"/>
                 <w:szCs w:val="22"/>
               </w:rPr>
-              <w:t xml:space="preserve"> </w:t>
             </w:r>
           </w:p>
         </w:tc>
         <w:tc>
           <w:tcPr>
-            <w:tcW w:w="1841" w:type="dxa"/>
+            <w:tcW w:w="1842" w:type="dxa"/>
             <w:gridSpan w:val="2"/>
-            <w:shd w:val="clear" w:color="auto" w:fill="auto"/>
+            <w:tcBorders/>
+            <w:shd w:color="auto" w:fill="auto" w:val="clear"/>
           </w:tcPr>
           <w:p>
             <w:pPr>
+              <w:pStyle w:val="Normal"/>
               <w:jc w:val="both"/>
+              <w:rPr>
+                <w:b/>
+                <w:bCs/>
+              </w:rPr>
             </w:pPr>
             <w:r>
               <w:rPr>
+                <w:b/>
+                <w:bCs/>
                 <w:sz w:val="22"/>
                 <w:szCs w:val="22"/>
               </w:rPr>
@@ -596,8 +674,9 @@
             </w:r>
             <w:r>
               <w:rPr>
-                <w:rFonts w:ascii="Arial" w:hAnsi="Arial" w:cs="Arial"/>
+                <w:rFonts w:cs="Arial" w:ascii="Arial" w:hAnsi="Arial"/>
                 <w:b/>
+                <w:bCs/>
                 <w:sz w:val="22"/>
                 <w:szCs w:val="22"/>
               </w:rPr>
@@ -607,11 +686,13 @@
         </w:tc>
         <w:tc>
           <w:tcPr>
-            <w:tcW w:w="3523" w:type="dxa"/>
-            <w:shd w:val="clear" w:color="auto" w:fill="auto"/>
+            <w:tcW w:w="3522" w:type="dxa"/>
+            <w:tcBorders/>
+            <w:shd w:color="auto" w:fill="auto" w:val="clear"/>
           </w:tcPr>
           <w:p>
             <w:pPr>
+              <w:pStyle w:val="Normal"/>
               <w:jc w:val="both"/>
               <w:rPr>
                 <w:b/>
@@ -619,32 +700,17 @@
                 <w:szCs w:val="22"/>
               </w:rPr>
             </w:pPr>
-            <w:proofErr w:type="gramStart"/>
-            <w:r>
-              <w:rPr>
-                <w:sz w:val="22"/>
-                <w:szCs w:val="22"/>
-              </w:rPr>
-              <w:t>Celular :</w:t>
-            </w:r>
-            <w:proofErr w:type="gramEnd"/>
-            <w:r>
-              <w:rPr>
-                <w:sz w:val="22"/>
-                <w:szCs w:val="22"/>
-              </w:rPr>
-              <w:t xml:space="preserve"> </w:t>
-            </w:r>
-            <w:r>
-              <w:rPr>
-                <w:sz w:val="22"/>
-                <w:szCs w:val="22"/>
-              </w:rPr>
-              <w:t>${CELPHONE}</w:t>
+            <w:r>
+              <w:rPr>
+                <w:sz w:val="22"/>
+                <w:szCs w:val="22"/>
+              </w:rPr>
+              <w:t>Celular : ${CELPHONE}</w:t>
             </w:r>
           </w:p>
           <w:p>
             <w:pPr>
+              <w:pStyle w:val="Normal"/>
               <w:jc w:val="both"/>
               <w:rPr>
                 <w:b/>
@@ -652,21 +718,12 @@
                 <w:szCs w:val="22"/>
               </w:rPr>
             </w:pPr>
-            <w:proofErr w:type="gramStart"/>
-            <w:r>
-              <w:rPr>
-                <w:sz w:val="22"/>
-                <w:szCs w:val="22"/>
-              </w:rPr>
-              <w:t>Telefone :</w:t>
-            </w:r>
-            <w:proofErr w:type="gramEnd"/>
-            <w:r>
-              <w:rPr>
-                <w:sz w:val="22"/>
-                <w:szCs w:val="22"/>
-              </w:rPr>
-              <w:t xml:space="preserve"> </w:t>
+            <w:r>
+              <w:rPr>
+                <w:sz w:val="22"/>
+                <w:szCs w:val="22"/>
+              </w:rPr>
+              <w:t xml:space="preserve">Telefone : </w:t>
             </w:r>
             <w:r>
               <w:rPr>
@@ -680,14 +737,18 @@
         </w:tc>
       </w:tr>
       <w:tr>
+        <w:trPr/>
         <w:tc>
           <w:tcPr>
             <w:tcW w:w="2271" w:type="dxa"/>
-            <w:shd w:val="clear" w:color="auto" w:fill="auto"/>
+            <w:tcBorders/>
+            <w:shd w:color="auto" w:fill="auto" w:val="clear"/>
           </w:tcPr>
           <w:p>
             <w:pPr>
+              <w:pStyle w:val="Normal"/>
               <w:jc w:val="both"/>
+              <w:rPr/>
             </w:pPr>
             <w:r>
               <w:rPr>
@@ -698,7 +759,7 @@
             </w:r>
             <w:r>
               <w:rPr>
-                <w:rFonts w:ascii="Arial" w:hAnsi="Arial" w:cs="Arial"/>
+                <w:rFonts w:cs="Arial" w:ascii="Arial" w:hAnsi="Arial"/>
                 <w:b/>
                 <w:sz w:val="22"/>
                 <w:szCs w:val="22"/>
@@ -711,15 +772,18 @@
           <w:tcPr>
             <w:tcW w:w="2269" w:type="dxa"/>
             <w:gridSpan w:val="2"/>
-            <w:shd w:val="clear" w:color="auto" w:fill="auto"/>
+            <w:tcBorders/>
+            <w:shd w:color="auto" w:fill="auto" w:val="clear"/>
           </w:tcPr>
           <w:p>
             <w:pPr>
+              <w:pStyle w:val="Normal"/>
               <w:jc w:val="both"/>
+              <w:rPr/>
             </w:pPr>
             <w:r>
               <w:rPr>
-                <w:rFonts w:ascii="Arial" w:hAnsi="Arial" w:cs="Arial"/>
+                <w:rFonts w:cs="Arial" w:ascii="Arial" w:hAnsi="Arial"/>
                 <w:sz w:val="22"/>
                 <w:szCs w:val="22"/>
               </w:rPr>
@@ -727,48 +791,49 @@
             </w:r>
             <w:r>
               <w:rPr>
-                <w:rFonts w:ascii="Arial" w:hAnsi="Arial" w:cs="Arial"/>
+                <w:rFonts w:cs="Arial" w:ascii="Arial" w:hAnsi="Arial"/>
                 <w:b/>
                 <w:sz w:val="22"/>
                 <w:szCs w:val="22"/>
               </w:rPr>
-              <w:t xml:space="preserve"> </w:t>
-            </w:r>
-            <w:r>
-              <w:rPr>
-                <w:rFonts w:ascii="Arial" w:hAnsi="Arial" w:cs="Arial"/>
-                <w:b/>
-                <w:sz w:val="22"/>
-                <w:szCs w:val="22"/>
-              </w:rPr>
-              <w:t>${RG}</w:t>
+              <w:t xml:space="preserve"> ${RG}</w:t>
             </w:r>
           </w:p>
         </w:tc>
         <w:tc>
           <w:tcPr>
             <w:tcW w:w="1237" w:type="dxa"/>
-            <w:shd w:val="clear" w:color="auto" w:fill="auto"/>
+            <w:tcBorders/>
+            <w:shd w:color="auto" w:fill="auto" w:val="clear"/>
           </w:tcPr>
           <w:p>
             <w:pPr>
-              <w:snapToGrid w:val="0"/>
+              <w:pStyle w:val="Normal"/>
+              <w:snapToGrid w:val="false"/>
               <w:jc w:val="both"/>
               <w:rPr>
                 <w:sz w:val="18"/>
                 <w:szCs w:val="18"/>
               </w:rPr>
             </w:pPr>
+            <w:r>
+              <w:rPr>
+                <w:sz w:val="18"/>
+                <w:szCs w:val="18"/>
+              </w:rPr>
+            </w:r>
           </w:p>
         </w:tc>
         <w:tc>
           <w:tcPr>
-            <w:tcW w:w="3523" w:type="dxa"/>
-            <w:shd w:val="clear" w:color="auto" w:fill="auto"/>
+            <w:tcW w:w="3522" w:type="dxa"/>
+            <w:tcBorders/>
+            <w:shd w:color="auto" w:fill="auto" w:val="clear"/>
           </w:tcPr>
           <w:p>
             <w:pPr>
-              <w:snapToGrid w:val="0"/>
+              <w:pStyle w:val="Normal"/>
+              <w:snapToGrid w:val="false"/>
               <w:rPr>
                 <w:sz w:val="22"/>
                 <w:szCs w:val="22"/>
@@ -779,23 +844,7 @@
                 <w:sz w:val="22"/>
                 <w:szCs w:val="22"/>
               </w:rPr>
-              <w:t xml:space="preserve">Telefone de </w:t>
-            </w:r>
-            <w:proofErr w:type="gramStart"/>
-            <w:r>
-              <w:rPr>
-                <w:sz w:val="22"/>
-                <w:szCs w:val="22"/>
-              </w:rPr>
-              <w:t>recados :</w:t>
-            </w:r>
-            <w:proofErr w:type="gramEnd"/>
-            <w:r>
-              <w:rPr>
-                <w:sz w:val="22"/>
-                <w:szCs w:val="22"/>
-              </w:rPr>
-              <w:t xml:space="preserve"> </w:t>
+              <w:t xml:space="preserve">Telefone de recados : </w:t>
             </w:r>
             <w:r>
               <w:rPr>
@@ -809,14 +858,18 @@
         </w:tc>
       </w:tr>
       <w:tr>
+        <w:trPr/>
         <w:tc>
           <w:tcPr>
             <w:tcW w:w="2271" w:type="dxa"/>
-            <w:shd w:val="clear" w:color="auto" w:fill="auto"/>
+            <w:tcBorders/>
+            <w:shd w:color="auto" w:fill="auto" w:val="clear"/>
           </w:tcPr>
           <w:p>
             <w:pPr>
+              <w:pStyle w:val="Normal"/>
               <w:jc w:val="both"/>
+              <w:rPr/>
             </w:pPr>
             <w:r>
               <w:rPr>
@@ -839,9 +892,14 @@
           <w:tcPr>
             <w:tcW w:w="3506" w:type="dxa"/>
             <w:gridSpan w:val="3"/>
-            <w:shd w:val="clear" w:color="auto" w:fill="auto"/>
+            <w:tcBorders/>
+            <w:shd w:color="auto" w:fill="auto" w:val="clear"/>
           </w:tcPr>
           <w:p>
+            <w:pPr>
+              <w:pStyle w:val="Normal"/>
+              <w:rPr/>
+            </w:pPr>
             <w:r>
               <w:rPr>
                 <w:sz w:val="22"/>
@@ -851,30 +909,26 @@
             </w:r>
             <w:r>
               <w:rPr>
-                <w:rFonts w:ascii="Comic Sans MS" w:hAnsi="Comic Sans MS" w:cs="Arial"/>
+                <w:rFonts w:cs="Arial" w:ascii="Comic Sans MS" w:hAnsi="Comic Sans MS"/>
                 <w:b/>
                 <w:sz w:val="22"/>
                 <w:szCs w:val="22"/>
               </w:rPr>
-              <w:t xml:space="preserve"> </w:t>
-            </w:r>
-            <w:r>
-              <w:rPr>
-                <w:rFonts w:ascii="Comic Sans MS" w:hAnsi="Comic Sans MS" w:cs="Arial"/>
-                <w:b/>
-                <w:sz w:val="22"/>
-                <w:szCs w:val="22"/>
-              </w:rPr>
-              <w:t>${VALID_UNTIL}</w:t>
+              <w:t xml:space="preserve"> ${VALID_UNTIL}</w:t>
             </w:r>
           </w:p>
         </w:tc>
         <w:tc>
           <w:tcPr>
-            <w:tcW w:w="3523" w:type="dxa"/>
-            <w:shd w:val="clear" w:color="auto" w:fill="auto"/>
+            <w:tcW w:w="3522" w:type="dxa"/>
+            <w:tcBorders/>
+            <w:shd w:color="auto" w:fill="auto" w:val="clear"/>
           </w:tcPr>
           <w:p>
+            <w:pPr>
+              <w:pStyle w:val="Normal"/>
+              <w:rPr/>
+            </w:pPr>
             <w:r>
               <w:rPr>
                 <w:sz w:val="22"/>
@@ -884,7 +938,7 @@
             </w:r>
             <w:r>
               <w:rPr>
-                <w:rFonts w:ascii="Arial" w:hAnsi="Arial" w:cs="Arial"/>
+                <w:rFonts w:cs="Arial" w:ascii="Arial" w:hAnsi="Arial"/>
                 <w:b/>
                 <w:bCs/>
                 <w:sz w:val="22"/>
@@ -896,15 +950,19 @@
         </w:tc>
       </w:tr>
       <w:tr>
+        <w:trPr/>
         <w:tc>
           <w:tcPr>
             <w:tcW w:w="5777" w:type="dxa"/>
             <w:gridSpan w:val="4"/>
-            <w:shd w:val="clear" w:color="auto" w:fill="auto"/>
+            <w:tcBorders/>
+            <w:shd w:color="auto" w:fill="auto" w:val="clear"/>
           </w:tcPr>
           <w:p>
             <w:pPr>
+              <w:pStyle w:val="Normal"/>
               <w:jc w:val="both"/>
+              <w:rPr/>
             </w:pPr>
             <w:r>
               <w:rPr>
@@ -919,26 +977,21 @@
                 <w:sz w:val="22"/>
                 <w:szCs w:val="22"/>
               </w:rPr>
-              <w:t xml:space="preserve"> </w:t>
-            </w:r>
-            <w:r>
-              <w:rPr>
-                <w:b/>
-                <w:sz w:val="22"/>
-                <w:szCs w:val="22"/>
-              </w:rPr>
-              <w:t>${PIS}</w:t>
+              <w:t xml:space="preserve"> ${PIS}</w:t>
             </w:r>
           </w:p>
         </w:tc>
         <w:tc>
           <w:tcPr>
-            <w:tcW w:w="3523" w:type="dxa"/>
-            <w:shd w:val="clear" w:color="auto" w:fill="auto"/>
+            <w:tcW w:w="3522" w:type="dxa"/>
+            <w:tcBorders/>
+            <w:shd w:color="auto" w:fill="auto" w:val="clear"/>
           </w:tcPr>
           <w:p>
             <w:pPr>
+              <w:pStyle w:val="Normal"/>
               <w:jc w:val="both"/>
+              <w:rPr/>
             </w:pPr>
             <w:r>
               <w:rPr>
@@ -962,7 +1015,8 @@
     </w:tbl>
     <w:p>
       <w:pPr>
-        <w:spacing w:line="264" w:lineRule="auto"/>
+        <w:pStyle w:val="Normal"/>
+        <w:spacing w:lineRule="auto" w:line="264"/>
         <w:ind w:firstLine="1077"/>
         <w:jc w:val="both"/>
         <w:rPr>
@@ -970,18 +1024,32 @@
           <w:szCs w:val="10"/>
         </w:rPr>
       </w:pPr>
+      <w:r>
+        <w:rPr>
+          <w:sz w:val="10"/>
+          <w:szCs w:val="10"/>
+        </w:rPr>
+      </w:r>
     </w:p>
     <w:p>
       <w:pPr>
+        <w:pStyle w:val="Normal"/>
         <w:jc w:val="both"/>
         <w:rPr>
           <w:sz w:val="16"/>
           <w:szCs w:val="16"/>
         </w:rPr>
       </w:pPr>
+      <w:r>
+        <w:rPr>
+          <w:sz w:val="16"/>
+          <w:szCs w:val="16"/>
+        </w:rPr>
+      </w:r>
     </w:p>
     <w:p>
       <w:pPr>
+        <w:pStyle w:val="Normal"/>
         <w:jc w:val="both"/>
         <w:rPr>
           <w:sz w:val="16"/>
@@ -998,17 +1066,28 @@
     </w:p>
     <w:p>
       <w:pPr>
+        <w:pStyle w:val="Normal"/>
         <w:jc w:val="both"/>
         <w:rPr>
+          <w:i/>
           <w:i/>
           <w:sz w:val="20"/>
           <w:szCs w:val="20"/>
         </w:rPr>
       </w:pPr>
+      <w:r>
+        <w:rPr>
+          <w:i/>
+          <w:sz w:val="20"/>
+          <w:szCs w:val="20"/>
+        </w:rPr>
+      </w:r>
     </w:p>
     <w:p>
       <w:pPr>
+        <w:pStyle w:val="Normal"/>
         <w:jc w:val="center"/>
+        <w:rPr/>
       </w:pPr>
       <w:r>
         <w:rPr>
@@ -1029,48 +1108,71 @@
     </w:p>
     <w:p>
       <w:pPr>
-        <w:rPr>
+        <w:pStyle w:val="Normal"/>
+        <w:rPr>
+          <w:i/>
           <w:i/>
           <w:sz w:val="20"/>
           <w:szCs w:val="20"/>
         </w:rPr>
       </w:pPr>
+      <w:r>
+        <w:rPr>
+          <w:i/>
+          <w:sz w:val="20"/>
+          <w:szCs w:val="20"/>
+        </w:rPr>
+      </w:r>
     </w:p>
-    <w:p/>
+    <w:p>
+      <w:pPr>
+        <w:pStyle w:val="Normal"/>
+        <w:rPr/>
+      </w:pPr>
+      <w:r>
+        <w:rPr/>
+      </w:r>
+    </w:p>
     <w:sectPr>
+      <w:type w:val="nextPage"/>
       <w:pgSz w:w="11906" w:h="16838"/>
-      <w:pgMar w:top="709" w:right="1701" w:bottom="1417" w:left="1260" w:header="0" w:footer="0" w:gutter="0"/>
-      <w:cols w:space="720"/>
-      <w:formProt w:val="0"/>
-      <w:docGrid w:linePitch="360" w:charSpace="-6145"/>
+      <w:pgMar w:left="1260" w:right="1701" w:gutter="0" w:header="0" w:top="709" w:footer="0" w:bottom="1417"/>
+      <w:pgNumType w:fmt="decimal"/>
+      <w:formProt w:val="false"/>
+      <w:textDirection w:val="lrTb"/>
+      <w:docGrid w:type="default" w:linePitch="360" w:charSpace="0"/>
     </w:sectPr>
   </w:body>
 </w:document>
 </file>
 
 <file path=word/styles.xml><?xml version="1.0" encoding="utf-8"?>
-<w:styles xmlns:mc="http://schemas.openxmlformats.org/markup-compatibility/2006" xmlns:r="http://schemas.openxmlformats.org/officeDocument/2006/relationships" xmlns:w="http://schemas.openxmlformats.org/wordprocessingml/2006/main" xmlns:w14="http://schemas.microsoft.com/office/word/2010/wordml" xmlns:w15="http://schemas.microsoft.com/office/word/2012/wordml" xmlns:w16cex="http://schemas.microsoft.com/office/word/2018/wordml/cex" xmlns:w16cid="http://schemas.microsoft.com/office/word/2016/wordml/cid" xmlns:w16="http://schemas.microsoft.com/office/word/2018/wordml" xmlns:w16du="http://schemas.microsoft.com/office/word/2023/wordml/word16du" xmlns:w16sdtdh="http://schemas.microsoft.com/office/word/2020/wordml/sdtdatahash" xmlns:w16sdtfl="http://schemas.microsoft.com/office/word/2024/wordml/sdtformatlock" xmlns:w16se="http://schemas.microsoft.com/office/word/2015/wordml/symex" mc:Ignorable="w14 w15 w16se w16cid w16 w16cex w16sdtdh w16sdtfl w16du">
+<w:styles xmlns:w="http://schemas.openxmlformats.org/wordprocessingml/2006/main" xmlns:w14="http://schemas.microsoft.com/office/word/2010/wordml" xmlns:mc="http://schemas.openxmlformats.org/markup-compatibility/2006" mc:Ignorable="w14">
   <w:docDefaults>
     <w:rPrDefault>
       <w:rPr>
-        <w:rFonts w:ascii="Liberation Serif" w:eastAsia="SimSun" w:hAnsi="Liberation Serif" w:cs="Arial"/>
+        <w:rFonts w:ascii="Liberation Serif" w:hAnsi="Liberation Serif" w:eastAsia="SimSun" w:cs="Arial"/>
         <w:szCs w:val="24"/>
         <w:lang w:val="pt-BR" w:eastAsia="zh-CN" w:bidi="hi-IN"/>
       </w:rPr>
     </w:rPrDefault>
-    <w:pPrDefault/>
+    <w:pPrDefault>
+      <w:pPr>
+        <w:suppressAutoHyphens w:val="true"/>
+      </w:pPr>
+    </w:pPrDefault>
   </w:docDefaults>
   <w:latentStyles w:defLockedState="0" w:defUIPriority="99" w:defSemiHidden="0" w:defUnhideWhenUsed="0" w:defQFormat="0" w:count="376">
     <w:lsdException w:name="Normal" w:uiPriority="0" w:qFormat="1"/>
     <w:lsdException w:name="heading 1" w:uiPriority="9" w:qFormat="1"/>
-    <w:lsdException w:name="heading 2" w:semiHidden="1" w:uiPriority="9" w:unhideWhenUsed="1" w:qFormat="1"/>
-    <w:lsdException w:name="heading 3" w:semiHidden="1" w:uiPriority="9" w:unhideWhenUsed="1" w:qFormat="1"/>
-    <w:lsdException w:name="heading 4" w:semiHidden="1" w:uiPriority="9" w:unhideWhenUsed="1" w:qFormat="1"/>
-    <w:lsdException w:name="heading 5" w:semiHidden="1" w:uiPriority="9" w:unhideWhenUsed="1" w:qFormat="1"/>
-    <w:lsdException w:name="heading 6" w:semiHidden="1" w:uiPriority="9" w:unhideWhenUsed="1" w:qFormat="1"/>
-    <w:lsdException w:name="heading 7" w:semiHidden="1" w:uiPriority="9" w:unhideWhenUsed="1" w:qFormat="1"/>
-    <w:lsdException w:name="heading 8" w:semiHidden="1" w:uiPriority="9" w:unhideWhenUsed="1" w:qFormat="1"/>
-    <w:lsdException w:name="heading 9" w:semiHidden="1" w:uiPriority="9" w:unhideWhenUsed="1" w:qFormat="1"/>
+    <w:lsdException w:name="heading 2" w:uiPriority="9" w:semiHidden="1" w:unhideWhenUsed="1" w:qFormat="1"/>
+    <w:lsdException w:name="heading 3" w:uiPriority="9" w:semiHidden="1" w:unhideWhenUsed="1" w:qFormat="1"/>
+    <w:lsdException w:name="heading 4" w:uiPriority="9" w:semiHidden="1" w:unhideWhenUsed="1" w:qFormat="1"/>
+    <w:lsdException w:name="heading 5" w:uiPriority="9" w:semiHidden="1" w:unhideWhenUsed="1" w:qFormat="1"/>
+    <w:lsdException w:name="heading 6" w:uiPriority="9" w:semiHidden="1" w:unhideWhenUsed="1" w:qFormat="1"/>
+    <w:lsdException w:name="heading 7" w:uiPriority="9" w:semiHidden="1" w:unhideWhenUsed="1" w:qFormat="1"/>
+    <w:lsdException w:name="heading 8" w:uiPriority="9" w:semiHidden="1" w:unhideWhenUsed="1" w:qFormat="1"/>
+    <w:lsdException w:name="heading 9" w:uiPriority="9" w:semiHidden="1" w:unhideWhenUsed="1" w:qFormat="1"/>
     <w:lsdException w:name="index 1" w:semiHidden="1" w:unhideWhenUsed="1"/>
     <w:lsdException w:name="index 2" w:semiHidden="1" w:unhideWhenUsed="1"/>
     <w:lsdException w:name="index 3" w:semiHidden="1" w:unhideWhenUsed="1"/>
@@ -1080,22 +1182,22 @@
     <w:lsdException w:name="index 7" w:semiHidden="1" w:unhideWhenUsed="1"/>
     <w:lsdException w:name="index 8" w:semiHidden="1" w:unhideWhenUsed="1"/>
     <w:lsdException w:name="index 9" w:semiHidden="1" w:unhideWhenUsed="1"/>
-    <w:lsdException w:name="toc 1" w:semiHidden="1" w:uiPriority="39" w:unhideWhenUsed="1"/>
-    <w:lsdException w:name="toc 2" w:semiHidden="1" w:uiPriority="39" w:unhideWhenUsed="1"/>
-    <w:lsdException w:name="toc 3" w:semiHidden="1" w:uiPriority="39" w:unhideWhenUsed="1"/>
-    <w:lsdException w:name="toc 4" w:semiHidden="1" w:uiPriority="39" w:unhideWhenUsed="1"/>
-    <w:lsdException w:name="toc 5" w:semiHidden="1" w:uiPriority="39" w:unhideWhenUsed="1"/>
-    <w:lsdException w:name="toc 6" w:semiHidden="1" w:uiPriority="39" w:unhideWhenUsed="1"/>
-    <w:lsdException w:name="toc 7" w:semiHidden="1" w:uiPriority="39" w:unhideWhenUsed="1"/>
-    <w:lsdException w:name="toc 8" w:semiHidden="1" w:uiPriority="39" w:unhideWhenUsed="1"/>
-    <w:lsdException w:name="toc 9" w:semiHidden="1" w:uiPriority="39" w:unhideWhenUsed="1"/>
+    <w:lsdException w:name="toc 1" w:uiPriority="39" w:semiHidden="1" w:unhideWhenUsed="1"/>
+    <w:lsdException w:name="toc 2" w:uiPriority="39" w:semiHidden="1" w:unhideWhenUsed="1"/>
+    <w:lsdException w:name="toc 3" w:uiPriority="39" w:semiHidden="1" w:unhideWhenUsed="1"/>
+    <w:lsdException w:name="toc 4" w:uiPriority="39" w:semiHidden="1" w:unhideWhenUsed="1"/>
+    <w:lsdException w:name="toc 5" w:uiPriority="39" w:semiHidden="1" w:unhideWhenUsed="1"/>
+    <w:lsdException w:name="toc 6" w:uiPriority="39" w:semiHidden="1" w:unhideWhenUsed="1"/>
+    <w:lsdException w:name="toc 7" w:uiPriority="39" w:semiHidden="1" w:unhideWhenUsed="1"/>
+    <w:lsdException w:name="toc 8" w:uiPriority="39" w:semiHidden="1" w:unhideWhenUsed="1"/>
+    <w:lsdException w:name="toc 9" w:uiPriority="39" w:semiHidden="1" w:unhideWhenUsed="1"/>
     <w:lsdException w:name="Normal Indent" w:semiHidden="1" w:unhideWhenUsed="1"/>
     <w:lsdException w:name="footnote text" w:semiHidden="1" w:unhideWhenUsed="1"/>
     <w:lsdException w:name="annotation text" w:semiHidden="1" w:unhideWhenUsed="1"/>
     <w:lsdException w:name="header" w:semiHidden="1" w:unhideWhenUsed="1"/>
     <w:lsdException w:name="footer" w:semiHidden="1" w:unhideWhenUsed="1"/>
     <w:lsdException w:name="index heading" w:semiHidden="1" w:unhideWhenUsed="1"/>
-    <w:lsdException w:name="caption" w:semiHidden="1" w:uiPriority="35" w:unhideWhenUsed="1" w:qFormat="1"/>
+    <w:lsdException w:name="caption" w:uiPriority="35" w:semiHidden="1" w:unhideWhenUsed="1" w:qFormat="1"/>
     <w:lsdException w:name="table of figures" w:semiHidden="1" w:unhideWhenUsed="1"/>
     <w:lsdException w:name="envelope address" w:semiHidden="1" w:unhideWhenUsed="1"/>
     <w:lsdException w:name="envelope return" w:semiHidden="1" w:unhideWhenUsed="1"/>
@@ -1126,7 +1228,7 @@
     <w:lsdException w:name="Title" w:uiPriority="10" w:qFormat="1"/>
     <w:lsdException w:name="Closing" w:semiHidden="1" w:unhideWhenUsed="1"/>
     <w:lsdException w:name="Signature" w:semiHidden="1" w:unhideWhenUsed="1"/>
-    <w:lsdException w:name="Default Paragraph Font" w:semiHidden="1" w:uiPriority="1" w:unhideWhenUsed="1"/>
+    <w:lsdException w:name="Default Paragraph Font" w:uiPriority="1" w:semiHidden="1" w:unhideWhenUsed="1"/>
     <w:lsdException w:name="Body Text" w:semiHidden="1" w:unhideWhenUsed="1"/>
     <w:lsdException w:name="Body Text Indent" w:semiHidden="1" w:unhideWhenUsed="1"/>
     <w:lsdException w:name="List Continue" w:semiHidden="1" w:unhideWhenUsed="1"/>
@@ -1326,8 +1428,8 @@
     <w:lsdException w:name="Subtle Reference" w:uiPriority="31" w:qFormat="1"/>
     <w:lsdException w:name="Intense Reference" w:uiPriority="32" w:qFormat="1"/>
     <w:lsdException w:name="Book Title" w:uiPriority="33" w:qFormat="1"/>
-    <w:lsdException w:name="Bibliography" w:semiHidden="1" w:uiPriority="37" w:unhideWhenUsed="1"/>
-    <w:lsdException w:name="TOC Heading" w:semiHidden="1" w:uiPriority="39" w:unhideWhenUsed="1" w:qFormat="1"/>
+    <w:lsdException w:name="Bibliography" w:uiPriority="37" w:semiHidden="1" w:unhideWhenUsed="1"/>
+    <w:lsdException w:name="TOC Heading" w:uiPriority="39" w:semiHidden="1" w:unhideWhenUsed="1" w:qFormat="1"/>
     <w:lsdException w:name="Plain Table 1" w:uiPriority="41"/>
     <w:lsdException w:name="Plain Table 2" w:uiPriority="42"/>
     <w:lsdException w:name="Plain Table 3" w:uiPriority="43"/>
@@ -1438,45 +1540,35 @@
     <w:lsdException w:name="Unresolved Mention" w:semiHidden="1" w:unhideWhenUsed="1"/>
     <w:lsdException w:name="Smart Link" w:semiHidden="1" w:unhideWhenUsed="1"/>
   </w:latentStyles>
-  <w:style w:type="paragraph" w:default="1" w:styleId="Normal">
+  <w:style w:type="paragraph" w:styleId="Normal" w:default="1">
     <w:name w:val="Normal"/>
     <w:qFormat/>
     <w:rsid w:val="00907050"/>
+    <w:pPr>
+      <w:widowControl/>
+      <w:suppressAutoHyphens w:val="true"/>
+      <w:bidi w:val="0"/>
+      <w:spacing w:before="0" w:after="0"/>
+      <w:jc w:val="left"/>
+    </w:pPr>
     <w:rPr>
-      <w:rFonts w:ascii="Times New Roman" w:eastAsia="Times New Roman" w:hAnsi="Times New Roman" w:cs="Times New Roman"/>
+      <w:rFonts w:ascii="Times New Roman" w:hAnsi="Times New Roman" w:eastAsia="Times New Roman" w:cs="Times New Roman"/>
       <w:color w:val="00000A"/>
+      <w:kern w:val="0"/>
       <w:sz w:val="24"/>
-      <w:lang w:bidi="ar-SA"/>
+      <w:szCs w:val="24"/>
+      <w:lang w:val="pt-BR" w:eastAsia="zh-CN" w:bidi="ar-SA"/>
     </w:rPr>
   </w:style>
-  <w:style w:type="character" w:default="1" w:styleId="Fontepargpadro">
+  <w:style w:type="character" w:styleId="DefaultParagraphFont" w:default="1">
     <w:name w:val="Default Paragraph Font"/>
     <w:uiPriority w:val="1"/>
     <w:semiHidden/>
     <w:unhideWhenUsed/>
+    <w:qFormat/>
+    <w:rPr/>
   </w:style>
-  <w:style w:type="table" w:default="1" w:styleId="Tabelanormal">
-    <w:name w:val="Normal Table"/>
-    <w:uiPriority w:val="99"/>
-    <w:semiHidden/>
-    <w:unhideWhenUsed/>
-    <w:tblPr>
-      <w:tblInd w:w="0" w:type="dxa"/>
-      <w:tblCellMar>
-        <w:top w:w="0" w:type="dxa"/>
-        <w:left w:w="108" w:type="dxa"/>
-        <w:bottom w:w="0" w:type="dxa"/>
-        <w:right w:w="108" w:type="dxa"/>
-      </w:tblCellMar>
-    </w:tblPr>
-  </w:style>
-  <w:style w:type="numbering" w:default="1" w:styleId="Semlista">
-    <w:name w:val="No List"/>
-    <w:uiPriority w:val="99"/>
-    <w:semiHidden/>
-    <w:unhideWhenUsed/>
-  </w:style>
-  <w:style w:type="character" w:customStyle="1" w:styleId="CabealhoChar">
+  <w:style w:type="character" w:styleId="CabealhoChar" w:customStyle="1">
     <w:name w:val="Cabeçalho Char"/>
     <w:qFormat/>
     <w:rsid w:val="00907050"/>
@@ -1485,7 +1577,7 @@
       <w:szCs w:val="24"/>
     </w:rPr>
   </w:style>
-  <w:style w:type="character" w:customStyle="1" w:styleId="RodapChar">
+  <w:style w:type="character" w:styleId="RodapChar" w:customStyle="1">
     <w:name w:val="Rodapé Char"/>
     <w:qFormat/>
     <w:rsid w:val="00907050"/>
@@ -1495,38 +1587,83 @@
     </w:rPr>
   </w:style>
   <w:style w:type="paragraph" w:styleId="Ttulo">
-    <w:name w:val="Title"/>
+    <w:name w:val="Título"/>
     <w:basedOn w:val="Normal"/>
-    <w:next w:val="Corpodetexto"/>
+    <w:next w:val="BodyText"/>
     <w:qFormat/>
-    <w:rsid w:val="00907050"/>
     <w:pPr>
-      <w:keepNext/>
+      <w:keepNext w:val="true"/>
       <w:spacing w:before="240" w:after="120"/>
     </w:pPr>
     <w:rPr>
-      <w:rFonts w:ascii="Liberation Sans" w:eastAsia="Microsoft YaHei" w:hAnsi="Liberation Sans" w:cs="Arial"/>
+      <w:rFonts w:ascii="Liberation Sans" w:hAnsi="Liberation Sans" w:eastAsia="Noto Sans CJK SC" w:cs="Noto Sans Devanagari"/>
       <w:sz w:val="28"/>
       <w:szCs w:val="28"/>
     </w:rPr>
   </w:style>
-  <w:style w:type="paragraph" w:styleId="Corpodetexto">
+  <w:style w:type="paragraph" w:styleId="BodyText">
     <w:name w:val="Body Text"/>
     <w:basedOn w:val="Normal"/>
     <w:rsid w:val="00907050"/>
     <w:pPr>
-      <w:spacing w:after="140" w:line="288" w:lineRule="auto"/>
+      <w:spacing w:lineRule="auto" w:line="288" w:before="0" w:after="140"/>
     </w:pPr>
+    <w:rPr/>
   </w:style>
-  <w:style w:type="paragraph" w:styleId="Lista">
+  <w:style w:type="paragraph" w:styleId="List">
     <w:name w:val="List"/>
-    <w:basedOn w:val="Corpodetexto"/>
+    <w:basedOn w:val="BodyText"/>
     <w:rsid w:val="00907050"/>
+    <w:pPr/>
     <w:rPr>
       <w:rFonts w:cs="Arial"/>
     </w:rPr>
   </w:style>
-  <w:style w:type="paragraph" w:customStyle="1" w:styleId="Legenda1">
+  <w:style w:type="paragraph" w:styleId="Caption">
+    <w:name w:val="Caption"/>
+    <w:basedOn w:val="Normal"/>
+    <w:qFormat/>
+    <w:pPr>
+      <w:suppressLineNumbers/>
+      <w:spacing w:before="120" w:after="120"/>
+    </w:pPr>
+    <w:rPr>
+      <w:rFonts w:cs="Noto Sans Devanagari"/>
+      <w:i/>
+      <w:iCs/>
+      <w:sz w:val="24"/>
+      <w:szCs w:val="24"/>
+    </w:rPr>
+  </w:style>
+  <w:style w:type="paragraph" w:styleId="ndice" w:customStyle="1">
+    <w:name w:val="Índice"/>
+    <w:basedOn w:val="Normal"/>
+    <w:qFormat/>
+    <w:rsid w:val="00907050"/>
+    <w:pPr>
+      <w:suppressLineNumbers/>
+    </w:pPr>
+    <w:rPr>
+      <w:rFonts w:cs="Arial"/>
+    </w:rPr>
+  </w:style>
+  <w:style w:type="paragraph" w:styleId="Title">
+    <w:name w:val="Title"/>
+    <w:basedOn w:val="Normal"/>
+    <w:next w:val="BodyText"/>
+    <w:qFormat/>
+    <w:rsid w:val="00907050"/>
+    <w:pPr>
+      <w:keepNext w:val="true"/>
+      <w:spacing w:before="240" w:after="120"/>
+    </w:pPr>
+    <w:rPr>
+      <w:rFonts w:ascii="Liberation Sans" w:hAnsi="Liberation Sans" w:eastAsia="Microsoft YaHei" w:cs="Arial"/>
+      <w:sz w:val="28"/>
+      <w:szCs w:val="28"/>
+    </w:rPr>
+  </w:style>
+  <w:style w:type="paragraph" w:styleId="Legenda1" w:customStyle="1">
     <w:name w:val="Legenda1"/>
     <w:basedOn w:val="Normal"/>
     <w:qFormat/>
@@ -1541,52 +1678,47 @@
       <w:iCs/>
     </w:rPr>
   </w:style>
-  <w:style w:type="paragraph" w:customStyle="1" w:styleId="ndice">
-    <w:name w:val="Índice"/>
-    <w:basedOn w:val="Normal"/>
-    <w:qFormat/>
-    <w:rsid w:val="00907050"/>
-    <w:pPr>
-      <w:suppressLineNumbers/>
-    </w:pPr>
-    <w:rPr>
-      <w:rFonts w:cs="Arial"/>
-    </w:rPr>
-  </w:style>
-  <w:style w:type="paragraph" w:styleId="Textodebalo">
+  <w:style w:type="paragraph" w:styleId="BalloonText">
     <w:name w:val="Balloon Text"/>
     <w:basedOn w:val="Normal"/>
     <w:qFormat/>
     <w:rsid w:val="00907050"/>
+    <w:pPr/>
     <w:rPr>
       <w:rFonts w:ascii="Tahoma" w:hAnsi="Tahoma" w:cs="Tahoma"/>
       <w:sz w:val="16"/>
       <w:szCs w:val="16"/>
     </w:rPr>
   </w:style>
-  <w:style w:type="paragraph" w:customStyle="1" w:styleId="Cabealho1">
+  <w:style w:type="paragraph" w:styleId="Cabealho1" w:customStyle="1">
     <w:name w:val="Cabeçalho1"/>
     <w:basedOn w:val="Normal"/>
+    <w:qFormat/>
     <w:rsid w:val="00907050"/>
     <w:pPr>
       <w:tabs>
-        <w:tab w:val="center" w:pos="4252"/>
-        <w:tab w:val="right" w:pos="8504"/>
+        <w:tab w:val="clear" w:pos="709"/>
+        <w:tab w:val="center" w:pos="4252" w:leader="none"/>
+        <w:tab w:val="right" w:pos="8504" w:leader="none"/>
       </w:tabs>
     </w:pPr>
+    <w:rPr/>
   </w:style>
-  <w:style w:type="paragraph" w:customStyle="1" w:styleId="Rodap1">
+  <w:style w:type="paragraph" w:styleId="Rodap1" w:customStyle="1">
     <w:name w:val="Rodapé1"/>
     <w:basedOn w:val="Normal"/>
+    <w:qFormat/>
     <w:rsid w:val="00907050"/>
     <w:pPr>
       <w:tabs>
-        <w:tab w:val="center" w:pos="4252"/>
-        <w:tab w:val="right" w:pos="8504"/>
+        <w:tab w:val="clear" w:pos="709"/>
+        <w:tab w:val="center" w:pos="4252" w:leader="none"/>
+        <w:tab w:val="right" w:pos="8504" w:leader="none"/>
       </w:tabs>
     </w:pPr>
+    <w:rPr/>
   </w:style>
-  <w:style w:type="paragraph" w:customStyle="1" w:styleId="Contedodatabela">
+  <w:style w:type="paragraph" w:styleId="Contedodatabela" w:customStyle="1">
     <w:name w:val="Conteúdo da tabela"/>
     <w:basedOn w:val="Normal"/>
     <w:qFormat/>
@@ -1594,8 +1726,9 @@
     <w:pPr>
       <w:suppressLineNumbers/>
     </w:pPr>
+    <w:rPr/>
   </w:style>
-  <w:style w:type="paragraph" w:customStyle="1" w:styleId="Ttulodetabela">
+  <w:style w:type="paragraph" w:styleId="Ttulodetabela" w:customStyle="1">
     <w:name w:val="Título de tabela"/>
     <w:basedOn w:val="Contedodatabela"/>
     <w:qFormat/>
@@ -1608,51 +1741,74 @@
       <w:bCs/>
     </w:rPr>
   </w:style>
-  <w:style w:type="paragraph" w:customStyle="1" w:styleId="Contedodoquadro">
+  <w:style w:type="paragraph" w:styleId="Contedodoquadro" w:customStyle="1">
     <w:name w:val="Conteúdo do quadro"/>
     <w:basedOn w:val="Normal"/>
     <w:qFormat/>
     <w:rsid w:val="00907050"/>
+    <w:pPr/>
+    <w:rPr/>
+  </w:style>
+  <w:style w:type="numbering" w:styleId="Semlista" w:default="1">
+    <w:name w:val="Sem lista"/>
+    <w:uiPriority w:val="99"/>
+    <w:semiHidden/>
+    <w:unhideWhenUsed/>
+    <w:qFormat/>
+  </w:style>
+  <w:style w:type="table" w:default="1" w:styleId="Tabelanormal">
+    <w:name w:val="Normal Table"/>
+    <w:uiPriority w:val="99"/>
+    <w:semiHidden/>
+    <w:unhideWhenUsed/>
+    <w:tblPr>
+      <w:tblCellMar>
+        <w:top w:w="0" w:type="dxa"/>
+        <w:left w:w="108" w:type="dxa"/>
+        <w:bottom w:w="0" w:type="dxa"/>
+        <w:right w:w="108" w:type="dxa"/>
+      </w:tblCellMar>
+    </w:tblPr>
   </w:style>
 </w:styles>
 </file>
 
 <file path=word/theme/theme1.xml><?xml version="1.0" encoding="utf-8"?>
-<a:theme xmlns:a="http://schemas.openxmlformats.org/drawingml/2006/main" name="Tema do Office">
+<a:theme xmlns:a="http://schemas.openxmlformats.org/drawingml/2006/main" xmlns:r="http://schemas.openxmlformats.org/officeDocument/2006/relationships" name="Tema do Office">
   <a:themeElements>
     <a:clrScheme name="Escritório">
       <a:dk1>
-        <a:sysClr val="windowText" lastClr="000000"/>
+        <a:srgbClr val="000000"/>
       </a:dk1>
       <a:lt1>
-        <a:sysClr val="window" lastClr="FFFFFF"/>
+        <a:srgbClr val="ffffff"/>
       </a:lt1>
       <a:dk2>
-        <a:srgbClr val="1F497D"/>
+        <a:srgbClr val="1f497d"/>
       </a:dk2>
       <a:lt2>
-        <a:srgbClr val="EEECE1"/>
+        <a:srgbClr val="eeece1"/>
       </a:lt2>
       <a:accent1>
-        <a:srgbClr val="4F81BD"/>
+        <a:srgbClr val="4f81bd"/>
       </a:accent1>
       <a:accent2>
-        <a:srgbClr val="C0504D"/>
+        <a:srgbClr val="c0504d"/>
       </a:accent2>
       <a:accent3>
-        <a:srgbClr val="9BBB59"/>
+        <a:srgbClr val="9bbb59"/>
       </a:accent3>
       <a:accent4>
-        <a:srgbClr val="8064A2"/>
+        <a:srgbClr val="8064a2"/>
       </a:accent4>
       <a:accent5>
-        <a:srgbClr val="4BACC6"/>
+        <a:srgbClr val="4bacc6"/>
       </a:accent5>
       <a:accent6>
-        <a:srgbClr val="F79646"/>
+        <a:srgbClr val="f79646"/>
       </a:accent6>
       <a:hlink>
-        <a:srgbClr val="0000FF"/>
+        <a:srgbClr val="0000ff"/>
       </a:hlink>
       <a:folHlink>
         <a:srgbClr val="800080"/>
@@ -1660,242 +1816,134 @@
     </a:clrScheme>
     <a:fontScheme name="Escritório">
       <a:majorFont>
-        <a:latin typeface="Cambria"/>
+        <a:latin typeface="Cambria" pitchFamily="0" charset="1"/>
         <a:ea typeface=""/>
         <a:cs typeface=""/>
-        <a:font script="Jpan" typeface="ＭＳ ゴシック"/>
-        <a:font script="Hang" typeface="맑은 고딕"/>
-        <a:font script="Hans" typeface="宋体"/>
-        <a:font script="Hant" typeface="新細明體"/>
-        <a:font script="Arab" typeface="Times New Roman"/>
-        <a:font script="Hebr" typeface="Times New Roman"/>
-        <a:font script="Thai" typeface="Angsana New"/>
-        <a:font script="Ethi" typeface="Nyala"/>
-        <a:font script="Beng" typeface="Vrinda"/>
-        <a:font script="Gujr" typeface="Shruti"/>
-        <a:font script="Khmr" typeface="MoolBoran"/>
-        <a:font script="Knda" typeface="Tunga"/>
-        <a:font script="Guru" typeface="Raavi"/>
-        <a:font script="Cans" typeface="Euphemia"/>
-        <a:font script="Cher" typeface="Plantagenet Cherokee"/>
-        <a:font script="Yiii" typeface="Microsoft Yi Baiti"/>
-        <a:font script="Tibt" typeface="Microsoft Himalaya"/>
-        <a:font script="Thaa" typeface="MV Boli"/>
-        <a:font script="Deva" typeface="Mangal"/>
-        <a:font script="Telu" typeface="Gautami"/>
-        <a:font script="Taml" typeface="Latha"/>
-        <a:font script="Syrc" typeface="Estrangelo Edessa"/>
-        <a:font script="Orya" typeface="Kalinga"/>
-        <a:font script="Mlym" typeface="Kartika"/>
-        <a:font script="Laoo" typeface="DokChampa"/>
-        <a:font script="Sinh" typeface="Iskoola Pota"/>
-        <a:font script="Mong" typeface="Mongolian Baiti"/>
-        <a:font script="Viet" typeface="Times New Roman"/>
-        <a:font script="Uigh" typeface="Microsoft Uighur"/>
       </a:majorFont>
       <a:minorFont>
-        <a:latin typeface="Calibri"/>
+        <a:latin typeface="Calibri" pitchFamily="0" charset="1"/>
         <a:ea typeface=""/>
         <a:cs typeface=""/>
-        <a:font script="Jpan" typeface="ＭＳ 明朝"/>
-        <a:font script="Hang" typeface="맑은 고딕"/>
-        <a:font script="Hans" typeface="宋体"/>
-        <a:font script="Hant" typeface="新細明體"/>
-        <a:font script="Arab" typeface="Arial"/>
-        <a:font script="Hebr" typeface="Arial"/>
-        <a:font script="Thai" typeface="Cordia New"/>
-        <a:font script="Ethi" typeface="Nyala"/>
-        <a:font script="Beng" typeface="Vrinda"/>
-        <a:font script="Gujr" typeface="Shruti"/>
-        <a:font script="Khmr" typeface="DaunPenh"/>
-        <a:font script="Knda" typeface="Tunga"/>
-        <a:font script="Guru" typeface="Raavi"/>
-        <a:font script="Cans" typeface="Euphemia"/>
-        <a:font script="Cher" typeface="Plantagenet Cherokee"/>
-        <a:font script="Yiii" typeface="Microsoft Yi Baiti"/>
-        <a:font script="Tibt" typeface="Microsoft Himalaya"/>
-        <a:font script="Thaa" typeface="MV Boli"/>
-        <a:font script="Deva" typeface="Mangal"/>
-        <a:font script="Telu" typeface="Gautami"/>
-        <a:font script="Taml" typeface="Latha"/>
-        <a:font script="Syrc" typeface="Estrangelo Edessa"/>
-        <a:font script="Orya" typeface="Kalinga"/>
-        <a:font script="Mlym" typeface="Kartika"/>
-        <a:font script="Laoo" typeface="DokChampa"/>
-        <a:font script="Sinh" typeface="Iskoola Pota"/>
-        <a:font script="Mong" typeface="Mongolian Baiti"/>
-        <a:font script="Viet" typeface="Arial"/>
-        <a:font script="Uigh" typeface="Microsoft Uighur"/>
       </a:minorFont>
     </a:fontScheme>
-    <a:fmtScheme name="Escritório">
+    <a:fmtScheme>
       <a:fillStyleLst>
         <a:solidFill>
           <a:schemeClr val="phClr"/>
         </a:solidFill>
-        <a:gradFill rotWithShape="1">
+        <a:gradFill>
           <a:gsLst>
             <a:gs pos="0">
               <a:schemeClr val="phClr">
                 <a:tint val="50000"/>
-                <a:satMod val="300000"/>
               </a:schemeClr>
             </a:gs>
             <a:gs pos="35000">
               <a:schemeClr val="phClr">
                 <a:tint val="37000"/>
-                <a:satMod val="300000"/>
               </a:schemeClr>
             </a:gs>
             <a:gs pos="100000">
               <a:schemeClr val="phClr">
                 <a:tint val="15000"/>
-                <a:satMod val="350000"/>
               </a:schemeClr>
             </a:gs>
           </a:gsLst>
           <a:lin ang="16200000" scaled="1"/>
+          <a:tileRect l="0" t="0" r="0" b="0"/>
         </a:gradFill>
-        <a:gradFill rotWithShape="1">
+        <a:gradFill>
           <a:gsLst>
             <a:gs pos="0">
               <a:schemeClr val="phClr">
                 <a:shade val="51000"/>
-                <a:satMod val="130000"/>
               </a:schemeClr>
             </a:gs>
             <a:gs pos="80000">
               <a:schemeClr val="phClr">
                 <a:shade val="93000"/>
-                <a:satMod val="130000"/>
               </a:schemeClr>
             </a:gs>
             <a:gs pos="100000">
               <a:schemeClr val="phClr">
                 <a:shade val="94000"/>
-                <a:satMod val="135000"/>
               </a:schemeClr>
             </a:gs>
           </a:gsLst>
           <a:lin ang="16200000" scaled="0"/>
+          <a:tileRect l="0" t="0" r="0" b="0"/>
         </a:gradFill>
       </a:fillStyleLst>
       <a:lnStyleLst>
         <a:ln w="9525" cap="flat" cmpd="sng" algn="ctr">
-          <a:solidFill>
-            <a:schemeClr val="phClr">
-              <a:shade val="95000"/>
-              <a:satMod val="105000"/>
-            </a:schemeClr>
-          </a:solidFill>
           <a:prstDash val="solid"/>
         </a:ln>
         <a:ln w="25400" cap="flat" cmpd="sng" algn="ctr">
-          <a:solidFill>
-            <a:schemeClr val="phClr"/>
-          </a:solidFill>
           <a:prstDash val="solid"/>
         </a:ln>
         <a:ln w="38100" cap="flat" cmpd="sng" algn="ctr">
-          <a:solidFill>
-            <a:schemeClr val="phClr"/>
-          </a:solidFill>
           <a:prstDash val="solid"/>
         </a:ln>
       </a:lnStyleLst>
       <a:effectStyleLst>
         <a:effectStyle>
-          <a:effectLst>
-            <a:outerShdw blurRad="40000" dist="20000" dir="5400000" rotWithShape="0">
-              <a:srgbClr val="000000">
-                <a:alpha val="38000"/>
-              </a:srgbClr>
-            </a:outerShdw>
-          </a:effectLst>
+          <a:effectLst/>
         </a:effectStyle>
         <a:effectStyle>
-          <a:effectLst>
-            <a:outerShdw blurRad="40000" dist="23000" dir="5400000" rotWithShape="0">
-              <a:srgbClr val="000000">
-                <a:alpha val="35000"/>
-              </a:srgbClr>
-            </a:outerShdw>
-          </a:effectLst>
+          <a:effectLst/>
         </a:effectStyle>
         <a:effectStyle>
-          <a:effectLst>
-            <a:outerShdw blurRad="40000" dist="23000" dir="5400000" rotWithShape="0">
-              <a:srgbClr val="000000">
-                <a:alpha val="35000"/>
-              </a:srgbClr>
-            </a:outerShdw>
-          </a:effectLst>
-          <a:scene3d>
-            <a:camera prst="orthographicFront">
-              <a:rot lat="0" lon="0" rev="0"/>
-            </a:camera>
-            <a:lightRig rig="threePt" dir="t">
-              <a:rot lat="0" lon="0" rev="1200000"/>
-            </a:lightRig>
-          </a:scene3d>
-          <a:sp3d>
-            <a:bevelT w="63500" h="25400"/>
-          </a:sp3d>
+          <a:effectLst/>
         </a:effectStyle>
       </a:effectStyleLst>
       <a:bgFillStyleLst>
         <a:solidFill>
           <a:schemeClr val="phClr"/>
         </a:solidFill>
-        <a:gradFill rotWithShape="1">
+        <a:gradFill>
           <a:gsLst>
             <a:gs pos="0">
               <a:schemeClr val="phClr">
                 <a:tint val="40000"/>
-                <a:satMod val="350000"/>
               </a:schemeClr>
             </a:gs>
             <a:gs pos="40000">
               <a:schemeClr val="phClr">
                 <a:tint val="45000"/>
                 <a:shade val="99000"/>
-                <a:satMod val="350000"/>
               </a:schemeClr>
             </a:gs>
             <a:gs pos="100000">
               <a:schemeClr val="phClr">
                 <a:shade val="20000"/>
-                <a:satMod val="255000"/>
               </a:schemeClr>
             </a:gs>
           </a:gsLst>
           <a:path path="circle">
             <a:fillToRect l="50000" t="-80000" r="50000" b="180000"/>
           </a:path>
+          <a:tileRect l="0" t="0" r="0" b="0"/>
         </a:gradFill>
-        <a:gradFill rotWithShape="1">
+        <a:gradFill>
           <a:gsLst>
             <a:gs pos="0">
               <a:schemeClr val="phClr">
                 <a:tint val="80000"/>
-                <a:satMod val="300000"/>
               </a:schemeClr>
             </a:gs>
             <a:gs pos="100000">
               <a:schemeClr val="phClr">
                 <a:shade val="30000"/>
-                <a:satMod val="200000"/>
               </a:schemeClr>
             </a:gs>
           </a:gsLst>
           <a:path path="circle">
             <a:fillToRect l="50000" t="50000" r="50000" b="50000"/>
           </a:path>
+          <a:tileRect l="0" t="0" r="0" b="0"/>
         </a:gradFill>
       </a:bgFillStyleLst>
     </a:fmtScheme>
   </a:themeElements>
-  <a:objectDefaults/>
-  <a:extraClrSchemeLst/>
 </a:theme>
 </file>
</xml_diff>